<commit_message>
finished the paper, added some more model checks to the appendix
</commit_message>
<xml_diff>
--- a/manuscript/appendix.docx
+++ b/manuscript/appendix.docx
@@ -59,7 +59,7 @@
         <w:t xml:space="preserve">Nólsoy, Faroe Islands</w:t>
       </w:r>
     </w:p>
-    <w:bookmarkStart w:id="37" w:name="appendix-1"/>
+    <w:bookmarkStart w:id="38" w:name="appendix-1"/>
     <w:p>
       <w:pPr>
         <w:pStyle w:val="Heading1"/>
@@ -81,7 +81,436 @@
       <w:tr>
         <w:tc>
           <w:tcPr/>
-          <w:bookmarkStart w:id="12" w:name="fig-pp-prior"/>
+          <w:bookmarkStart w:id="9" w:name="tbl-diagnostics"/>
+          <w:p>
+            <w:pPr>
+              <w:jc w:val="center"/>
+            </w:pPr>
+            <w:pPr>
+              <w:jc w:val="left"/>
+              <w:spacing w:before="200"/>
+              <w:pStyle w:val="ImageCaption"/>
+            </w:pPr>
+            <w:r>
+              <w:t xml:space="preserve">TABLE S 1. Convergence diagnostics (maximum R-hat and minimum bulk/tail effective sample size across fixed effects) and out-of-sample predictive fit (expected log pointwise predictive density (ELPD), effective number of parameters, and maximum Pareto k from approximate leave-one-out cross-validation) for the three fitted models.</w:t>
+            </w:r>
+          </w:p>
+          <w:tbl>
+            <w:tblPr>
+              <w:tblStyle w:val="Table"/>
+              <w:tblW w:type="pct" w:w="5000"/>
+              <w:tblLayout w:type="fixed"/>
+              <w:tblLook w:firstRow="1" w:lastRow="0" w:firstColumn="0" w:lastColumn="0" w:noHBand="0" w:noVBand="0" w:val="0020"/>
+            </w:tblPr>
+            <w:tblGrid>
+              <w:gridCol w:w="2661"/>
+              <w:gridCol w:w="584"/>
+              <w:gridCol w:w="843"/>
+              <w:gridCol w:w="843"/>
+              <w:gridCol w:w="1038"/>
+              <w:gridCol w:w="1103"/>
+              <w:gridCol w:w="843"/>
+            </w:tblGrid>
+            <w:tr>
+              <w:trPr>
+                <w:tblHeader w:val="on"/>
+              </w:trPr>
+              <w:tc>
+                <w:tcPr/>
+                <w:p>
+                  <w:pPr>
+                    <w:pStyle w:val="Compact"/>
+                    <w:jc w:val="left"/>
+                    <w:jc w:val="center"/>
+                  </w:pPr>
+                  <w:r>
+                    <w:t xml:space="preserve">Model</w:t>
+                  </w:r>
+                </w:p>
+              </w:tc>
+              <w:tc>
+                <w:tcPr/>
+                <w:p>
+                  <w:pPr>
+                    <w:pStyle w:val="Compact"/>
+                    <w:jc w:val="right"/>
+                    <w:jc w:val="center"/>
+                  </w:pPr>
+                  <w:r>
+                    <w:t xml:space="preserve">Max Rhat</w:t>
+                  </w:r>
+                </w:p>
+              </w:tc>
+              <w:tc>
+                <w:tcPr/>
+                <w:p>
+                  <w:pPr>
+                    <w:pStyle w:val="Compact"/>
+                    <w:jc w:val="right"/>
+                    <w:jc w:val="center"/>
+                  </w:pPr>
+                  <w:r>
+                    <w:t xml:space="preserve">Min Bulk ESS</w:t>
+                  </w:r>
+                </w:p>
+              </w:tc>
+              <w:tc>
+                <w:tcPr/>
+                <w:p>
+                  <w:pPr>
+                    <w:pStyle w:val="Compact"/>
+                    <w:jc w:val="right"/>
+                    <w:jc w:val="center"/>
+                  </w:pPr>
+                  <w:r>
+                    <w:t xml:space="preserve">Min Tail ESS</w:t>
+                  </w:r>
+                </w:p>
+              </w:tc>
+              <w:tc>
+                <w:tcPr/>
+                <w:p>
+                  <w:pPr>
+                    <w:pStyle w:val="Compact"/>
+                    <w:jc w:val="left"/>
+                    <w:jc w:val="center"/>
+                  </w:pPr>
+                  <w:r>
+                    <w:t xml:space="preserve">ELPD (SE)</w:t>
+                  </w:r>
+                </w:p>
+              </w:tc>
+              <w:tc>
+                <w:tcPr/>
+                <w:p>
+                  <w:pPr>
+                    <w:pStyle w:val="Compact"/>
+                    <w:jc w:val="left"/>
+                    <w:jc w:val="center"/>
+                  </w:pPr>
+                  <w:r>
+                    <w:t xml:space="preserve">Eff. params (SE)</w:t>
+                  </w:r>
+                </w:p>
+              </w:tc>
+              <w:tc>
+                <w:tcPr/>
+                <w:p>
+                  <w:pPr>
+                    <w:pStyle w:val="Compact"/>
+                    <w:jc w:val="right"/>
+                    <w:jc w:val="center"/>
+                  </w:pPr>
+                  <w:r>
+                    <w:t xml:space="preserve">Max Pareto k</w:t>
+                  </w:r>
+                </w:p>
+              </w:tc>
+            </w:tr>
+            <w:tr>
+              <w:tc>
+                <w:tcPr/>
+                <w:p>
+                  <w:pPr>
+                    <w:pStyle w:val="Compact"/>
+                    <w:jc w:val="left"/>
+                    <w:jc w:val="center"/>
+                  </w:pPr>
+                  <w:r>
+                    <w:t xml:space="preserve">M1: breeding status ~ year x brood patch</w:t>
+                  </w:r>
+                </w:p>
+              </w:tc>
+              <w:tc>
+                <w:tcPr/>
+                <w:p>
+                  <w:pPr>
+                    <w:pStyle w:val="Compact"/>
+                    <w:jc w:val="right"/>
+                    <w:jc w:val="center"/>
+                  </w:pPr>
+                  <w:r>
+                    <w:t xml:space="preserve">1.000</w:t>
+                  </w:r>
+                </w:p>
+              </w:tc>
+              <w:tc>
+                <w:tcPr/>
+                <w:p>
+                  <w:pPr>
+                    <w:pStyle w:val="Compact"/>
+                    <w:jc w:val="right"/>
+                    <w:jc w:val="center"/>
+                  </w:pPr>
+                  <w:r>
+                    <w:t xml:space="preserve">9350</w:t>
+                  </w:r>
+                </w:p>
+              </w:tc>
+              <w:tc>
+                <w:tcPr/>
+                <w:p>
+                  <w:pPr>
+                    <w:pStyle w:val="Compact"/>
+                    <w:jc w:val="right"/>
+                    <w:jc w:val="center"/>
+                  </w:pPr>
+                  <w:r>
+                    <w:t xml:space="preserve">8917</w:t>
+                  </w:r>
+                </w:p>
+              </w:tc>
+              <w:tc>
+                <w:tcPr/>
+                <w:p>
+                  <w:pPr>
+                    <w:pStyle w:val="Compact"/>
+                    <w:jc w:val="left"/>
+                    <w:jc w:val="center"/>
+                  </w:pPr>
+                  <w:r>
+                    <w:t xml:space="preserve">-856.24 (26.99)</w:t>
+                  </w:r>
+                </w:p>
+              </w:tc>
+              <w:tc>
+                <w:tcPr/>
+                <w:p>
+                  <w:pPr>
+                    <w:pStyle w:val="Compact"/>
+                    <w:jc w:val="left"/>
+                    <w:jc w:val="center"/>
+                  </w:pPr>
+                  <w:r>
+                    <w:t xml:space="preserve">3.69 (0.28)</w:t>
+                  </w:r>
+                </w:p>
+              </w:tc>
+              <w:tc>
+                <w:tcPr/>
+                <w:p>
+                  <w:pPr>
+                    <w:pStyle w:val="Compact"/>
+                    <w:jc w:val="right"/>
+                    <w:jc w:val="center"/>
+                  </w:pPr>
+                  <w:r>
+                    <w:t xml:space="preserve">0.09</w:t>
+                  </w:r>
+                </w:p>
+              </w:tc>
+            </w:tr>
+            <w:tr>
+              <w:tc>
+                <w:tcPr/>
+                <w:p>
+                  <w:pPr>
+                    <w:pStyle w:val="Compact"/>
+                    <w:jc w:val="left"/>
+                    <w:jc w:val="center"/>
+                  </w:pPr>
+                  <w:r>
+                    <w:t xml:space="preserve">M2: brood patch ~ year (breeders only)</w:t>
+                  </w:r>
+                </w:p>
+              </w:tc>
+              <w:tc>
+                <w:tcPr/>
+                <w:p>
+                  <w:pPr>
+                    <w:pStyle w:val="Compact"/>
+                    <w:jc w:val="right"/>
+                    <w:jc w:val="center"/>
+                  </w:pPr>
+                  <w:r>
+                    <w:t xml:space="preserve">1.000</w:t>
+                  </w:r>
+                </w:p>
+              </w:tc>
+              <w:tc>
+                <w:tcPr/>
+                <w:p>
+                  <w:pPr>
+                    <w:pStyle w:val="Compact"/>
+                    <w:jc w:val="right"/>
+                    <w:jc w:val="center"/>
+                  </w:pPr>
+                  <w:r>
+                    <w:t xml:space="preserve">10456</w:t>
+                  </w:r>
+                </w:p>
+              </w:tc>
+              <w:tc>
+                <w:tcPr/>
+                <w:p>
+                  <w:pPr>
+                    <w:pStyle w:val="Compact"/>
+                    <w:jc w:val="right"/>
+                    <w:jc w:val="center"/>
+                  </w:pPr>
+                  <w:r>
+                    <w:t xml:space="preserve">7412</w:t>
+                  </w:r>
+                </w:p>
+              </w:tc>
+              <w:tc>
+                <w:tcPr/>
+                <w:p>
+                  <w:pPr>
+                    <w:pStyle w:val="Compact"/>
+                    <w:jc w:val="left"/>
+                    <w:jc w:val="center"/>
+                  </w:pPr>
+                  <w:r>
+                    <w:t xml:space="preserve">-308.38 (6.02)</w:t>
+                  </w:r>
+                </w:p>
+              </w:tc>
+              <w:tc>
+                <w:tcPr/>
+                <w:p>
+                  <w:pPr>
+                    <w:pStyle w:val="Compact"/>
+                    <w:jc w:val="left"/>
+                    <w:jc w:val="center"/>
+                  </w:pPr>
+                  <w:r>
+                    <w:t xml:space="preserve">1.93 (0.07)</w:t>
+                  </w:r>
+                </w:p>
+              </w:tc>
+              <w:tc>
+                <w:tcPr/>
+                <w:p>
+                  <w:pPr>
+                    <w:pStyle w:val="Compact"/>
+                    <w:jc w:val="right"/>
+                    <w:jc w:val="center"/>
+                  </w:pPr>
+                  <w:r>
+                    <w:t xml:space="preserve">0.07</w:t>
+                  </w:r>
+                </w:p>
+              </w:tc>
+            </w:tr>
+            <w:tr>
+              <w:tc>
+                <w:tcPr/>
+                <w:p>
+                  <w:pPr>
+                    <w:pStyle w:val="Compact"/>
+                    <w:jc w:val="left"/>
+                    <w:jc w:val="center"/>
+                  </w:pPr>
+                  <w:r>
+                    <w:t xml:space="preserve">M1, 2007 excluded</w:t>
+                  </w:r>
+                </w:p>
+              </w:tc>
+              <w:tc>
+                <w:tcPr/>
+                <w:p>
+                  <w:pPr>
+                    <w:pStyle w:val="Compact"/>
+                    <w:jc w:val="right"/>
+                    <w:jc w:val="center"/>
+                  </w:pPr>
+                  <w:r>
+                    <w:t xml:space="preserve">1.001</w:t>
+                  </w:r>
+                </w:p>
+              </w:tc>
+              <w:tc>
+                <w:tcPr/>
+                <w:p>
+                  <w:pPr>
+                    <w:pStyle w:val="Compact"/>
+                    <w:jc w:val="right"/>
+                    <w:jc w:val="center"/>
+                  </w:pPr>
+                  <w:r>
+                    <w:t xml:space="preserve">9798</w:t>
+                  </w:r>
+                </w:p>
+              </w:tc>
+              <w:tc>
+                <w:tcPr/>
+                <w:p>
+                  <w:pPr>
+                    <w:pStyle w:val="Compact"/>
+                    <w:jc w:val="right"/>
+                    <w:jc w:val="center"/>
+                  </w:pPr>
+                  <w:r>
+                    <w:t xml:space="preserve">7990</w:t>
+                  </w:r>
+                </w:p>
+              </w:tc>
+              <w:tc>
+                <w:tcPr/>
+                <w:p>
+                  <w:pPr>
+                    <w:pStyle w:val="Compact"/>
+                    <w:jc w:val="left"/>
+                    <w:jc w:val="center"/>
+                  </w:pPr>
+                  <w:r>
+                    <w:t xml:space="preserve">-852.90 (26.96)</w:t>
+                  </w:r>
+                </w:p>
+              </w:tc>
+              <w:tc>
+                <w:tcPr/>
+                <w:p>
+                  <w:pPr>
+                    <w:pStyle w:val="Compact"/>
+                    <w:jc w:val="left"/>
+                    <w:jc w:val="center"/>
+                  </w:pPr>
+                  <w:r>
+                    <w:t xml:space="preserve">3.71 (0.28)</w:t>
+                  </w:r>
+                </w:p>
+              </w:tc>
+              <w:tc>
+                <w:tcPr/>
+                <w:p>
+                  <w:pPr>
+                    <w:pStyle w:val="Compact"/>
+                    <w:jc w:val="right"/>
+                    <w:jc w:val="center"/>
+                  </w:pPr>
+                  <w:r>
+                    <w:t xml:space="preserve">0.11</w:t>
+                  </w:r>
+                </w:p>
+              </w:tc>
+            </w:tr>
+          </w:tbl>
+          <w:bookmarkEnd w:id="9"/>
+          <w:p/>
+        </w:tc>
+      </w:tr>
+    </w:tbl>
+    <w:p>
+      <w:r>
+        <w:br w:type="page"/>
+      </w:r>
+    </w:p>
+    <w:tbl>
+      <w:tblPr>
+        <w:tblStyle w:val="Table"/>
+        <w:tblW w:type="pct" w:w="5000"/>
+        <w:tblLayout w:type="fixed"/>
+        <w:tblLook w:firstRow="0" w:lastRow="0" w:firstColumn="0" w:lastColumn="0" w:noHBand="0" w:noVBand="0" w:val="0000"/>
+      </w:tblPr>
+      <w:tblGrid>
+        <w:gridCol w:w="7920"/>
+      </w:tblGrid>
+      <w:tr>
+        <w:tc>
+          <w:tcPr/>
+          <w:bookmarkStart w:id="13" w:name="fig-pp-prior"/>
           <w:p>
             <w:pPr>
               <w:pStyle w:val="Compact"/>
@@ -92,18 +521,18 @@
                 <wp:inline>
                   <wp:extent cx="5943600" cy="4245428"/>
                   <wp:effectExtent b="0" l="0" r="0" t="0"/>
-                  <wp:docPr descr="" title="" id="10" name="Picture"/>
+                  <wp:docPr descr="" title="" id="11" name="Picture"/>
                   <a:graphic>
                     <a:graphicData uri="http://schemas.openxmlformats.org/drawingml/2006/picture">
                       <pic:pic>
                         <pic:nvPicPr>
-                          <pic:cNvPr descr="appendix_files/figure-docx/fig-pp-prior-1.png" id="11" name="Picture"/>
+                          <pic:cNvPr descr="appendix_files/figure-docx/fig-pp-prior-1.png" id="12" name="Picture"/>
                           <pic:cNvPicPr>
                             <a:picLocks noChangeArrowheads="1" noChangeAspect="1"/>
                           </pic:cNvPicPr>
                         </pic:nvPicPr>
                         <pic:blipFill>
-                          <a:blip r:embed="rId9"/>
+                          <a:blip r:embed="rId10"/>
                           <a:stretch>
                             <a:fillRect/>
                           </a:stretch>
@@ -150,7 +579,7 @@
               <w:t xml:space="preserve"> 1. Prior predictive check for the primary model (M1: breeding status ~ year x brood patch), showing the prior predictive distribution of the mean breeding status (light lines) against the observed mean (dark line), confirming the priors imply plausible values before fitting to the data.</w:t>
             </w:r>
           </w:p>
-          <w:bookmarkEnd w:id="12"/>
+          <w:bookmarkEnd w:id="13"/>
         </w:tc>
       </w:tr>
     </w:tbl>
@@ -172,7 +601,7 @@
       <w:tr>
         <w:tc>
           <w:tcPr/>
-          <w:bookmarkStart w:id="16" w:name="fig-pp-model"/>
+          <w:bookmarkStart w:id="17" w:name="fig-pp-model"/>
           <w:p>
             <w:pPr>
               <w:pStyle w:val="Compact"/>
@@ -183,18 +612,18 @@
                 <wp:inline>
                   <wp:extent cx="5943600" cy="4245428"/>
                   <wp:effectExtent b="0" l="0" r="0" t="0"/>
-                  <wp:docPr descr="" title="" id="14" name="Picture"/>
+                  <wp:docPr descr="" title="" id="15" name="Picture"/>
                   <a:graphic>
                     <a:graphicData uri="http://schemas.openxmlformats.org/drawingml/2006/picture">
                       <pic:pic>
                         <pic:nvPicPr>
-                          <pic:cNvPr descr="appendix_files/figure-docx/fig-pp-model-1.png" id="15" name="Picture"/>
+                          <pic:cNvPr descr="appendix_files/figure-docx/fig-pp-model-1.png" id="16" name="Picture"/>
                           <pic:cNvPicPr>
                             <a:picLocks noChangeArrowheads="1" noChangeAspect="1"/>
                           </pic:cNvPicPr>
                         </pic:nvPicPr>
                         <pic:blipFill>
-                          <a:blip r:embed="rId13"/>
+                          <a:blip r:embed="rId14"/>
                           <a:stretch>
                             <a:fillRect/>
                           </a:stretch>
@@ -241,7 +670,7 @@
               <w:t xml:space="preserve"> 2. Posterior predictive check for the primary model (M1: breeding status ~ year x brood patch), comparing the observed mean breeding status (dark line) to the posterior predictive distribution (light lines).</w:t>
             </w:r>
           </w:p>
-          <w:bookmarkEnd w:id="16"/>
+          <w:bookmarkEnd w:id="17"/>
         </w:tc>
       </w:tr>
     </w:tbl>
@@ -263,7 +692,7 @@
       <w:tr>
         <w:tc>
           <w:tcPr/>
-          <w:bookmarkStart w:id="20" w:name="fig-mcmc-model"/>
+          <w:bookmarkStart w:id="21" w:name="fig-mcmc-model"/>
           <w:p>
             <w:pPr>
               <w:pStyle w:val="Compact"/>
@@ -272,20 +701,20 @@
             <w:r>
               <w:drawing>
                 <wp:inline>
-                  <wp:extent cx="5943600" cy="5943600"/>
+                  <wp:extent cx="5943600" cy="6792685"/>
                   <wp:effectExtent b="0" l="0" r="0" t="0"/>
-                  <wp:docPr descr="" title="" id="18" name="Picture"/>
+                  <wp:docPr descr="" title="" id="19" name="Picture"/>
                   <a:graphic>
                     <a:graphicData uri="http://schemas.openxmlformats.org/drawingml/2006/picture">
                       <pic:pic>
                         <pic:nvPicPr>
-                          <pic:cNvPr descr="appendix_files/figure-docx/fig-mcmc-model-1.png" id="19" name="Picture"/>
+                          <pic:cNvPr descr="appendix_files/figure-docx/fig-mcmc-model-1.png" id="20" name="Picture"/>
                           <pic:cNvPicPr>
                             <a:picLocks noChangeArrowheads="1" noChangeAspect="1"/>
                           </pic:cNvPicPr>
                         </pic:nvPicPr>
                         <pic:blipFill>
-                          <a:blip r:embed="rId17"/>
+                          <a:blip r:embed="rId18"/>
                           <a:stretch>
                             <a:fillRect/>
                           </a:stretch>
@@ -293,7 +722,7 @@
                         <pic:spPr bwMode="auto">
                           <a:xfrm>
                             <a:off x="0" y="0"/>
-                            <a:ext cx="5943600" cy="5943600"/>
+                            <a:ext cx="5943600" cy="6792685"/>
                           </a:xfrm>
                           <a:prstGeom prst="rect">
                             <a:avLst/>
@@ -329,10 +758,10 @@
               <w:t xml:space="preserve">Fig. S</w:t>
             </w:r>
             <w:r>
-              <w:t xml:space="preserve"> 3. MCMC trace plots for all parameters of the primary model (M1), used to assess chain mixing and convergence.</w:t>
+              <w:t xml:space="preserve"> 3. MCMC trace plots for all parameters of the primary model (M1), used to assess chain mixing and convergence. Brood.spot = brood patch.</w:t>
             </w:r>
           </w:p>
-          <w:bookmarkEnd w:id="20"/>
+          <w:bookmarkEnd w:id="21"/>
         </w:tc>
       </w:tr>
     </w:tbl>
@@ -354,7 +783,7 @@
       <w:tr>
         <w:tc>
           <w:tcPr/>
-          <w:bookmarkStart w:id="24" w:name="fig-pp-model2"/>
+          <w:bookmarkStart w:id="25" w:name="fig-pp-model2"/>
           <w:p>
             <w:pPr>
               <w:pStyle w:val="Compact"/>
@@ -365,18 +794,18 @@
                 <wp:inline>
                   <wp:extent cx="5943600" cy="4245428"/>
                   <wp:effectExtent b="0" l="0" r="0" t="0"/>
-                  <wp:docPr descr="" title="" id="22" name="Picture"/>
+                  <wp:docPr descr="" title="" id="23" name="Picture"/>
                   <a:graphic>
                     <a:graphicData uri="http://schemas.openxmlformats.org/drawingml/2006/picture">
                       <pic:pic>
                         <pic:nvPicPr>
-                          <pic:cNvPr descr="appendix_files/figure-docx/fig-pp-model2-1.png" id="23" name="Picture"/>
+                          <pic:cNvPr descr="appendix_files/figure-docx/fig-pp-model2-1.png" id="24" name="Picture"/>
                           <pic:cNvPicPr>
                             <a:picLocks noChangeArrowheads="1" noChangeAspect="1"/>
                           </pic:cNvPicPr>
                         </pic:nvPicPr>
                         <pic:blipFill>
-                          <a:blip r:embed="rId21"/>
+                          <a:blip r:embed="rId22"/>
                           <a:stretch>
                             <a:fillRect/>
                           </a:stretch>
@@ -423,7 +852,7 @@
               <w:t xml:space="preserve"> 4. Posterior predictive check for the robustness-check model (M2: brood patch presence ~ year), fitted to confirmed breeding-age females only.</w:t>
             </w:r>
           </w:p>
-          <w:bookmarkEnd w:id="24"/>
+          <w:bookmarkEnd w:id="25"/>
         </w:tc>
       </w:tr>
     </w:tbl>
@@ -445,7 +874,7 @@
       <w:tr>
         <w:tc>
           <w:tcPr/>
-          <w:bookmarkStart w:id="28" w:name="fig-mcmc-model2"/>
+          <w:bookmarkStart w:id="29" w:name="fig-mcmc-model2"/>
           <w:p>
             <w:pPr>
               <w:pStyle w:val="Compact"/>
@@ -456,18 +885,18 @@
                 <wp:inline>
                   <wp:extent cx="5943600" cy="4245428"/>
                   <wp:effectExtent b="0" l="0" r="0" t="0"/>
-                  <wp:docPr descr="" title="" id="26" name="Picture"/>
+                  <wp:docPr descr="" title="" id="27" name="Picture"/>
                   <a:graphic>
                     <a:graphicData uri="http://schemas.openxmlformats.org/drawingml/2006/picture">
                       <pic:pic>
                         <pic:nvPicPr>
-                          <pic:cNvPr descr="appendix_files/figure-docx/fig-mcmc-model2-1.png" id="27" name="Picture"/>
+                          <pic:cNvPr descr="appendix_files/figure-docx/fig-mcmc-model2-1.png" id="28" name="Picture"/>
                           <pic:cNvPicPr>
                             <a:picLocks noChangeArrowheads="1" noChangeAspect="1"/>
                           </pic:cNvPicPr>
                         </pic:nvPicPr>
                         <pic:blipFill>
-                          <a:blip r:embed="rId25"/>
+                          <a:blip r:embed="rId26"/>
                           <a:stretch>
                             <a:fillRect/>
                           </a:stretch>
@@ -514,7 +943,7 @@
               <w:t xml:space="preserve"> 5. MCMC trace plots for all parameters of the robustness-check model (M2).</w:t>
             </w:r>
           </w:p>
-          <w:bookmarkEnd w:id="28"/>
+          <w:bookmarkEnd w:id="29"/>
         </w:tc>
       </w:tr>
     </w:tbl>
@@ -536,7 +965,7 @@
       <w:tr>
         <w:tc>
           <w:tcPr/>
-          <w:bookmarkStart w:id="32" w:name="fig-pp-model2007"/>
+          <w:bookmarkStart w:id="33" w:name="fig-pp-model2007"/>
           <w:p>
             <w:pPr>
               <w:pStyle w:val="Compact"/>
@@ -547,18 +976,18 @@
                 <wp:inline>
                   <wp:extent cx="5943600" cy="4245428"/>
                   <wp:effectExtent b="0" l="0" r="0" t="0"/>
-                  <wp:docPr descr="" title="" id="30" name="Picture"/>
+                  <wp:docPr descr="" title="" id="31" name="Picture"/>
                   <a:graphic>
                     <a:graphicData uri="http://schemas.openxmlformats.org/drawingml/2006/picture">
                       <pic:pic>
                         <pic:nvPicPr>
-                          <pic:cNvPr descr="appendix_files/figure-docx/fig-pp-model2007-1.png" id="31" name="Picture"/>
+                          <pic:cNvPr descr="appendix_files/figure-docx/fig-pp-model2007-1.png" id="32" name="Picture"/>
                           <pic:cNvPicPr>
                             <a:picLocks noChangeArrowheads="1" noChangeAspect="1"/>
                           </pic:cNvPicPr>
                         </pic:nvPicPr>
                         <pic:blipFill>
-                          <a:blip r:embed="rId29"/>
+                          <a:blip r:embed="rId30"/>
                           <a:stretch>
                             <a:fillRect/>
                           </a:stretch>
@@ -605,7 +1034,7 @@
               <w:t xml:space="preserve"> 6. Posterior predictive check for the primary model refit excluding the 2007 breeding season.</w:t>
             </w:r>
           </w:p>
-          <w:bookmarkEnd w:id="32"/>
+          <w:bookmarkEnd w:id="33"/>
         </w:tc>
       </w:tr>
     </w:tbl>
@@ -627,7 +1056,7 @@
       <w:tr>
         <w:tc>
           <w:tcPr/>
-          <w:bookmarkStart w:id="36" w:name="fig-mcmc-model2007"/>
+          <w:bookmarkStart w:id="37" w:name="fig-mcmc-model2007"/>
           <w:p>
             <w:pPr>
               <w:pStyle w:val="Compact"/>
@@ -636,20 +1065,20 @@
             <w:r>
               <w:drawing>
                 <wp:inline>
-                  <wp:extent cx="5943600" cy="5943600"/>
+                  <wp:extent cx="5943600" cy="6792685"/>
                   <wp:effectExtent b="0" l="0" r="0" t="0"/>
-                  <wp:docPr descr="" title="" id="34" name="Picture"/>
+                  <wp:docPr descr="" title="" id="35" name="Picture"/>
                   <a:graphic>
                     <a:graphicData uri="http://schemas.openxmlformats.org/drawingml/2006/picture">
                       <pic:pic>
                         <pic:nvPicPr>
-                          <pic:cNvPr descr="appendix_files/figure-docx/fig-mcmc-model2007-1.png" id="35" name="Picture"/>
+                          <pic:cNvPr descr="appendix_files/figure-docx/fig-mcmc-model2007-1.png" id="36" name="Picture"/>
                           <pic:cNvPicPr>
                             <a:picLocks noChangeArrowheads="1" noChangeAspect="1"/>
                           </pic:cNvPicPr>
                         </pic:nvPicPr>
                         <pic:blipFill>
-                          <a:blip r:embed="rId33"/>
+                          <a:blip r:embed="rId34"/>
                           <a:stretch>
                             <a:fillRect/>
                           </a:stretch>
@@ -657,7 +1086,7 @@
                         <pic:spPr bwMode="auto">
                           <a:xfrm>
                             <a:off x="0" y="0"/>
-                            <a:ext cx="5943600" cy="5943600"/>
+                            <a:ext cx="5943600" cy="6792685"/>
                           </a:xfrm>
                           <a:prstGeom prst="rect">
                             <a:avLst/>
@@ -693,14 +1122,14 @@
               <w:t xml:space="preserve">Fig. S</w:t>
             </w:r>
             <w:r>
-              <w:t xml:space="preserve"> 7. MCMC trace plots for all parameters of the primary model refit excluding the 2007 breeding season.</w:t>
+              <w:t xml:space="preserve"> 7. MCMC trace plots for all parameters of the primary model refit excluding the 2007 breeding season. Brood.spot = brood patch.</w:t>
             </w:r>
           </w:p>
-          <w:bookmarkEnd w:id="36"/>
+          <w:bookmarkEnd w:id="37"/>
         </w:tc>
       </w:tr>
     </w:tbl>
-    <w:bookmarkEnd w:id="37"/>
+    <w:bookmarkEnd w:id="38"/>
     <w:sectPr>
       <w:type w:val="continuous"/>
       <w:pgSz w:h="15840" w:w="12240"/>

</xml_diff>

<commit_message>
last few changes, deleted a bunch of stale stuff
</commit_message>
<xml_diff>
--- a/manuscript/appendix.docx
+++ b/manuscript/appendix.docx
@@ -7,7 +7,17 @@
         <w:pStyle w:val="Title"/>
       </w:pPr>
       <w:r>
-        <w:t xml:space="preserve">PRE-BREEDING ATLANTIC PUFFINS (FRATERCULA ARCTICA) ARE DISAPPEARING FROM FAROESE COLONIES</w:t>
+        <w:t xml:space="preserve">PRE-BREEDING ATLANTIC PUFFINS (</w:t>
+      </w:r>
+      <w:r>
+        <w:rPr>
+          <w:i/>
+          <w:iCs/>
+        </w:rPr>
+        <w:t xml:space="preserve">FRATERCULA ARCTICA</w:t>
+      </w:r>
+      <w:r>
+        <w:t xml:space="preserve">) ARE DISAPPEARING FROM FAROESE COLONIES</w:t>
       </w:r>
     </w:p>
     <w:p>

</xml_diff>

<commit_message>
Second revision - editorial changes.
</commit_message>
<xml_diff>
--- a/manuscript/appendix.docx
+++ b/manuscript/appendix.docx
@@ -6,10 +6,18 @@
     <w:p>
       <w:pPr>
         <w:pStyle w:val="Heading1"/>
+        <w:spacing w:before="0" w:after="0"/>
       </w:pPr>
       <w:r>
         <w:t xml:space="preserve">Appendix</w:t>
       </w:r>
+    </w:p>
+    <w:p>
+      <w:pPr>
+        <w:pStyle w:val="BodyText"/>
+        <w:keepNext/>
+        <w:spacing w:after="0"/>
+      </w:pPr>
     </w:p>
     <w:tbl>
       <w:tblPr>
@@ -2283,7 +2291,7 @@
     <w:pPr>
       <w:keepNext/>
       <w:keepLines/>
-      <w:spacing w:after="120" w:before="360" w:line="240" w:lineRule="auto"/>
+      <w:spacing w:after="480" w:before="360" w:line="240" w:lineRule="auto"/>
       <w:ind w:firstLine="0"/>
       <w:jc w:val="center"/>
     </w:pPr>

</xml_diff>